<commit_message>
Facelift HTML, PDF, docx, and LaTeX formats
</commit_message>
<xml_diff>
--- a/src/reference.docx
+++ b/src/reference.docx
@@ -5020,8 +5020,8 @@
     <w:sectPr>
       <w:headerReference w:type="default" r:id="rId26"/>
       <w:footerReference w:type="default" r:id="rId27"/>
-      <w:pgSz w:w="12240" w:h="15840"/>
-      <w:pgMar w:top="1608" w:right="1417" w:bottom="1417" w:left="1417" w:header="708" w:footer="708" w:gutter="0"/>
+      <w:pgSz w:w="11906" w:h="16838"/>
+      <w:pgMar w:top="1418" w:right="1134" w:bottom="1134" w:left="1134" w:header="567" w:footer="567" w:gutter="0"/>
       <w:cols w:space="708"/>
       <w:titlePg/>
       <w:docGrid w:linePitch="326"/>
@@ -5060,13 +5060,8 @@
   <w:p>
     <w:pPr>
       <w:pStyle w:val="Footer"/>
-      <w:pBdr>
-        <w:top w:val="single" w:sz="18" w:space="5" w:color="E36C0A" w:themeColor="accent6" w:themeShade="BF"/>
-      </w:pBdr>
+      <w:jc w:val="right"/>
     </w:pPr>
-    <w:r>
-      <w:tab/>
-    </w:r>
     <w:r>
       <w:fldChar w:fldCharType="begin"/>
     </w:r>
@@ -5125,15 +5120,9 @@
     <w:pPr>
       <w:pStyle w:val="Header"/>
       <w:pBdr>
-        <w:bottom w:val="single" w:sz="18" w:space="1" w:color="E36C0A" w:themeColor="accent6" w:themeShade="BF"/>
+        <w:bottom w:val="single" w:sz="4" w:space="4" w:color="DDE2E6"/>
       </w:pBdr>
     </w:pPr>
-    <w:r>
-      <w:tab/>
-    </w:r>
-    <w:r>
-      <w:tab/>
-    </w:r>
     <w:sdt>
       <w:sdtPr>
         <w:alias w:val="Název"/>
@@ -5248,15 +5237,16 @@
   <w:docDefaults>
     <w:rPrDefault>
       <w:rPr>
-        <w:rFonts w:asciiTheme="minorHAnsi" w:eastAsiaTheme="minorHAnsi" w:hAnsiTheme="minorHAnsi" w:cstheme="minorBidi"/>
-        <w:sz w:val="24"/>
-        <w:szCs w:val="24"/>
+        <w:rFonts w:ascii="Calibri" w:hAnsi="Calibri" w:eastAsia="Calibri" w:cs="Calibri"/>
+        <w:color w:val="212529"/>
+        <w:sz w:val="20"/>
+        <w:szCs w:val="20"/>
         <w:lang w:val="en-US" w:eastAsia="en-US" w:bidi="ar-SA"/>
       </w:rPr>
     </w:rPrDefault>
     <w:pPrDefault>
       <w:pPr>
-        <w:spacing w:after="200"/>
+        <w:spacing w:after="120" w:line="264" w:lineRule="auto"/>
       </w:pPr>
     </w:pPrDefault>
   </w:docDefaults>
@@ -5611,16 +5601,22 @@
     <w:pPr>
       <w:keepNext/>
       <w:keepLines/>
-      <w:spacing w:before="480" w:after="0"/>
+      <w:pBdr>
+        <w:bottom w:val="single" w:sz="16" w:space="6" w:color="1D5F8A"/>
+      </w:pBdr>
+      <w:spacing w:before="0" w:after="200" w:line="264" w:lineRule="auto"/>
+      <w:jc w:val="left"/>
       <w:outlineLvl w:val="0"/>
     </w:pPr>
     <w:rPr>
-      <w:rFonts w:asciiTheme="majorHAnsi" w:eastAsiaTheme="majorEastAsia" w:hAnsiTheme="majorHAnsi" w:cstheme="majorBidi"/>
+      <w:rFonts w:ascii="Calibri" w:hAnsi="Calibri" w:eastAsia="Calibri" w:cs="Calibri"/>
       <w:b/>
       <w:bCs/>
-      <w:color w:val="4F81BD" w:themeColor="accent1"/>
-      <w:sz w:val="32"/>
-      <w:szCs w:val="32"/>
+      <w:i w:val="0"/>
+      <w:iCs w:val="0"/>
+      <w:color w:val="123F5C"/>
+      <w:sz w:val="36"/>
+      <w:szCs w:val="36"/>
     </w:rPr>
   </w:style>
   <w:style w:type="paragraph" w:styleId="Heading2">
@@ -5633,16 +5629,19 @@
     <w:pPr>
       <w:keepNext/>
       <w:keepLines/>
-      <w:spacing w:before="200" w:after="0"/>
+      <w:spacing w:before="320" w:after="60" w:line="264" w:lineRule="auto"/>
+      <w:jc w:val="left"/>
       <w:outlineLvl w:val="1"/>
     </w:pPr>
     <w:rPr>
-      <w:rFonts w:asciiTheme="majorHAnsi" w:eastAsiaTheme="majorEastAsia" w:hAnsiTheme="majorHAnsi" w:cstheme="majorBidi"/>
+      <w:rFonts w:ascii="Calibri" w:hAnsi="Calibri" w:eastAsia="Calibri" w:cs="Calibri"/>
       <w:b/>
       <w:bCs/>
-      <w:color w:val="4F81BD" w:themeColor="accent1"/>
-      <w:sz w:val="28"/>
-      <w:szCs w:val="28"/>
+      <w:i w:val="0"/>
+      <w:iCs w:val="0"/>
+      <w:color w:val="123F5C"/>
+      <w:sz w:val="24"/>
+      <w:szCs w:val="24"/>
     </w:rPr>
   </w:style>
   <w:style w:type="paragraph" w:styleId="Heading3">
@@ -5655,14 +5654,19 @@
     <w:pPr>
       <w:keepNext/>
       <w:keepLines/>
-      <w:spacing w:before="200" w:after="0"/>
+      <w:spacing w:before="240" w:after="60" w:line="264" w:lineRule="auto"/>
+      <w:jc w:val="left"/>
       <w:outlineLvl w:val="2"/>
     </w:pPr>
     <w:rPr>
-      <w:rFonts w:asciiTheme="majorHAnsi" w:eastAsiaTheme="majorEastAsia" w:hAnsiTheme="majorHAnsi" w:cstheme="majorBidi"/>
+      <w:rFonts w:ascii="Calibri" w:hAnsi="Calibri" w:eastAsia="Calibri" w:cs="Calibri"/>
       <w:b/>
       <w:bCs/>
-      <w:color w:val="4F81BD" w:themeColor="accent1"/>
+      <w:i w:val="0"/>
+      <w:iCs w:val="0"/>
+      <w:color w:val="123F5C"/>
+      <w:sz w:val="22"/>
+      <w:szCs w:val="22"/>
     </w:rPr>
   </w:style>
   <w:style w:type="paragraph" w:styleId="Heading4">
@@ -5675,14 +5679,19 @@
     <w:pPr>
       <w:keepNext/>
       <w:keepLines/>
-      <w:spacing w:before="200" w:after="0"/>
+      <w:spacing w:before="200" w:after="40" w:line="264" w:lineRule="auto"/>
+      <w:jc w:val="left"/>
       <w:outlineLvl w:val="3"/>
     </w:pPr>
     <w:rPr>
-      <w:rFonts w:asciiTheme="majorHAnsi" w:eastAsiaTheme="majorEastAsia" w:hAnsiTheme="majorHAnsi" w:cstheme="majorBidi"/>
+      <w:rFonts w:ascii="Calibri" w:hAnsi="Calibri" w:eastAsia="Calibri" w:cs="Calibri"/>
+      <w:b/>
       <w:bCs/>
-      <w:i/>
-      <w:color w:val="4F81BD" w:themeColor="accent1"/>
+      <w:i w:val="0"/>
+      <w:iCs w:val="0"/>
+      <w:color w:val="123F5C"/>
+      <w:sz w:val="21"/>
+      <w:szCs w:val="21"/>
     </w:rPr>
   </w:style>
   <w:style w:type="paragraph" w:styleId="Heading5">
@@ -5695,13 +5704,19 @@
     <w:pPr>
       <w:keepNext/>
       <w:keepLines/>
-      <w:spacing w:before="200" w:after="0"/>
+      <w:spacing w:before="160" w:after="40" w:line="264" w:lineRule="auto"/>
+      <w:jc w:val="left"/>
       <w:outlineLvl w:val="4"/>
     </w:pPr>
     <w:rPr>
-      <w:rFonts w:asciiTheme="majorHAnsi" w:eastAsiaTheme="majorEastAsia" w:hAnsiTheme="majorHAnsi" w:cstheme="majorBidi"/>
-      <w:iCs/>
-      <w:color w:val="4F81BD" w:themeColor="accent1"/>
+      <w:rFonts w:ascii="Calibri" w:hAnsi="Calibri" w:eastAsia="Calibri" w:cs="Calibri"/>
+      <w:b/>
+      <w:bCs/>
+      <w:i w:val="0"/>
+      <w:iCs w:val="0"/>
+      <w:color w:val="123F5C"/>
+      <w:sz w:val="20"/>
+      <w:szCs w:val="20"/>
     </w:rPr>
   </w:style>
   <w:style w:type="paragraph" w:styleId="Heading6">
@@ -5714,12 +5729,19 @@
     <w:pPr>
       <w:keepNext/>
       <w:keepLines/>
-      <w:spacing w:before="200" w:after="0"/>
+      <w:spacing w:before="160" w:after="40" w:line="264" w:lineRule="auto"/>
+      <w:jc w:val="left"/>
       <w:outlineLvl w:val="5"/>
     </w:pPr>
     <w:rPr>
-      <w:rFonts w:asciiTheme="majorHAnsi" w:eastAsiaTheme="majorEastAsia" w:hAnsiTheme="majorHAnsi" w:cstheme="majorBidi"/>
-      <w:color w:val="4F81BD" w:themeColor="accent1"/>
+      <w:rFonts w:ascii="Calibri" w:hAnsi="Calibri" w:eastAsia="Calibri" w:cs="Calibri"/>
+      <w:b/>
+      <w:bCs/>
+      <w:i w:val="0"/>
+      <w:iCs w:val="0"/>
+      <w:color w:val="123F5C"/>
+      <w:sz w:val="20"/>
+      <w:szCs w:val="20"/>
     </w:rPr>
   </w:style>
   <w:style w:type="paragraph" w:styleId="Heading7">
@@ -5807,25 +5829,28 @@
     <w:name w:val="Body Text"/>
     <w:basedOn w:val="Normal"/>
     <w:qFormat/>
-    <w:rsid w:val="009F4950"/>
     <w:pPr>
-      <w:spacing w:before="180" w:after="180"/>
-      <w:jc w:val="both"/>
+      <w:spacing w:before="0" w:after="120" w:line="264" w:lineRule="auto"/>
+      <w:jc w:val="left"/>
     </w:pPr>
   </w:style>
-  <w:style w:type="paragraph" w:customStyle="1" w:styleId="FirstParagraph">
+  <w:style w:type="paragraph" w:styleId="FirstParagraph" w:customStyle="1">
     <w:name w:val="First Paragraph"/>
     <w:basedOn w:val="BodyText"/>
     <w:next w:val="BodyText"/>
     <w:qFormat/>
-    <w:rsid w:val="009F4950"/>
-  </w:style>
-  <w:style w:type="paragraph" w:customStyle="1" w:styleId="Compact">
+    <w:pPr>
+      <w:spacing w:before="0" w:after="120" w:line="264" w:lineRule="auto"/>
+      <w:jc w:val="left"/>
+    </w:pPr>
+  </w:style>
+  <w:style w:type="paragraph" w:styleId="Compact" w:customStyle="1">
     <w:name w:val="Compact"/>
     <w:basedOn w:val="BodyText"/>
     <w:qFormat/>
     <w:pPr>
-      <w:spacing w:before="36" w:after="36"/>
+      <w:spacing w:before="20" w:after="20" w:line="264" w:lineRule="auto"/>
+      <w:jc w:val="left"/>
     </w:pPr>
   </w:style>
   <w:style w:type="paragraph" w:styleId="Title">
@@ -5833,19 +5858,24 @@
     <w:basedOn w:val="Normal"/>
     <w:next w:val="BodyText"/>
     <w:qFormat/>
-    <w:rsid w:val="009F4950"/>
     <w:pPr>
       <w:keepNext/>
       <w:keepLines/>
-      <w:spacing w:before="1200" w:after="7000"/>
-      <w:jc w:val="center"/>
+      <w:pBdr>
+        <w:bottom w:val="single" w:sz="24" w:space="10" w:color="1D5F8A"/>
+      </w:pBdr>
+      <w:spacing w:before="3200" w:after="360" w:line="264" w:lineRule="auto"/>
+      <w:jc w:val="left"/>
     </w:pPr>
     <w:rPr>
-      <w:rFonts w:asciiTheme="majorHAnsi" w:eastAsiaTheme="majorEastAsia" w:hAnsiTheme="majorHAnsi" w:cstheme="majorBidi"/>
+      <w:rFonts w:ascii="Calibri" w:hAnsi="Calibri" w:eastAsia="Calibri" w:cs="Calibri"/>
       <w:b/>
       <w:bCs/>
-      <w:sz w:val="44"/>
-      <w:szCs w:val="36"/>
+      <w:i w:val="0"/>
+      <w:iCs w:val="0"/>
+      <w:color w:val="123F5C"/>
+      <w:sz w:val="56"/>
+      <w:szCs w:val="56"/>
     </w:rPr>
   </w:style>
   <w:style w:type="paragraph" w:styleId="Subtitle">
@@ -5854,11 +5884,20 @@
     <w:next w:val="BodyText"/>
     <w:qFormat/>
     <w:pPr>
-      <w:spacing w:before="240" w:after="240"/>
+      <w:keepNext/>
+      <w:keepLines/>
+      <w:spacing w:before="0" w:after="240" w:line="264" w:lineRule="auto"/>
+      <w:jc w:val="left"/>
     </w:pPr>
     <w:rPr>
-      <w:sz w:val="30"/>
-      <w:szCs w:val="30"/>
+      <w:rFonts w:ascii="Calibri" w:hAnsi="Calibri" w:eastAsia="Calibri" w:cs="Calibri"/>
+      <w:b w:val="0"/>
+      <w:bCs w:val="0"/>
+      <w:i w:val="0"/>
+      <w:iCs w:val="0"/>
+      <w:color w:val="5F6B76"/>
+      <w:sz w:val="28"/>
+      <w:szCs w:val="28"/>
     </w:rPr>
   </w:style>
   <w:style w:type="paragraph" w:customStyle="1" w:styleId="Author">
@@ -5920,33 +5959,46 @@
     <w:unhideWhenUsed/>
     <w:qFormat/>
   </w:style>
-  <w:style w:type="table" w:customStyle="1" w:styleId="Table">
+  <w:style w:type="table" w:styleId="Table" w:customStyle="1">
     <w:name w:val="Table"/>
-    <w:semiHidden/>
+    <w:basedOn w:val="TableNormal"/>
     <w:unhideWhenUsed/>
     <w:qFormat/>
     <w:tblPr>
       <w:tblInd w:w="0" w:type="dxa"/>
+      <w:tblBorders>
+        <w:top w:val="single" w:sz="4" w:space="0" w:color="DDE2E6"/>
+        <w:bottom w:val="single" w:sz="4" w:space="0" w:color="DDE2E6"/>
+        <w:insideH w:val="single" w:sz="4" w:space="0" w:color="DDE2E6"/>
+      </w:tblBorders>
       <w:tblCellMar>
-        <w:top w:w="0" w:type="dxa"/>
-        <w:left w:w="108" w:type="dxa"/>
-        <w:bottom w:w="0" w:type="dxa"/>
-        <w:right w:w="108" w:type="dxa"/>
+        <w:top w:w="50" w:type="dxa"/>
+        <w:left w:w="100" w:type="dxa"/>
+        <w:bottom w:w="50" w:type="dxa"/>
+        <w:right w:w="100" w:type="dxa"/>
       </w:tblCellMar>
     </w:tblPr>
     <w:tblStylePr w:type="firstRow">
-      <w:tblPr>
-        <w:jc w:val="left"/>
-      </w:tblPr>
-      <w:trPr>
-        <w:jc w:val="left"/>
-      </w:trPr>
+      <w:rPr>
+        <w:b/>
+        <w:bCs/>
+        <w:caps/>
+        <w:color w:val="5F6B76"/>
+        <w:sz w:val="15"/>
+        <w:szCs w:val="15"/>
+      </w:rPr>
       <w:tcPr>
         <w:tcBorders>
-          <w:bottom w:val="single" w:sz="0" w:space="0" w:color="auto"/>
+          <w:bottom w:val="single" w:sz="8" w:space="0" w:color="1D5F8A"/>
         </w:tcBorders>
+        <w:shd w:val="clear" w:color="auto" w:fill="F5F7F9"/>
         <w:vAlign w:val="bottom"/>
       </w:tcPr>
+    </w:tblStylePr>
+    <w:tblStylePr w:type="firstCol">
+      <w:rPr>
+        <w:color w:val="5F6B76"/>
+      </w:rPr>
     </w:tblStylePr>
   </w:style>
   <w:style w:type="paragraph" w:customStyle="1" w:styleId="DefinitionTerm">
@@ -6026,9 +6078,9 @@
   </w:style>
   <w:style w:type="character" w:styleId="Hyperlink">
     <w:name w:val="Hyperlink"/>
-    <w:basedOn w:val="CaptionChar"/>
+    <w:qFormat/>
     <w:rPr>
-      <w:color w:val="4F81BD" w:themeColor="accent1"/>
+      <w:color w:val="1D5F8A"/>
     </w:rPr>
   </w:style>
   <w:style w:type="paragraph" w:styleId="TOCHeading">
@@ -6357,6 +6409,16 @@
       </w:tabs>
       <w:spacing w:after="0"/>
     </w:pPr>
+    <w:rPr>
+      <w:rFonts w:ascii="Calibri" w:hAnsi="Calibri" w:eastAsia="Calibri" w:cs="Calibri"/>
+      <w:b w:val="0"/>
+      <w:bCs w:val="0"/>
+      <w:i w:val="0"/>
+      <w:iCs w:val="0"/>
+      <w:color w:val="8A949E"/>
+      <w:sz w:val="15"/>
+      <w:szCs w:val="15"/>
+    </w:rPr>
   </w:style>
   <w:style w:type="character" w:customStyle="1" w:styleId="HeaderChar">
     <w:name w:val="Header Char"/>
@@ -6377,6 +6439,16 @@
       </w:tabs>
       <w:spacing w:after="0"/>
     </w:pPr>
+    <w:rPr>
+      <w:rFonts w:ascii="Calibri" w:hAnsi="Calibri" w:eastAsia="Calibri" w:cs="Calibri"/>
+      <w:b w:val="0"/>
+      <w:bCs w:val="0"/>
+      <w:i w:val="0"/>
+      <w:iCs w:val="0"/>
+      <w:color w:val="8A949E"/>
+      <w:sz w:val="15"/>
+      <w:szCs w:val="15"/>
+    </w:rPr>
   </w:style>
   <w:style w:type="character" w:customStyle="1" w:styleId="FooterChar">
     <w:name w:val="Footer Char"/>
@@ -6391,6 +6463,247 @@
     <w:rsid w:val="00646003"/>
     <w:rPr>
       <w:color w:val="808080"/>
+    </w:rPr>
+  </w:style>
+  <w:style w:type="paragraph" w:styleId="Answer" w:customStyle="1">
+    <w:name w:val="Answer"/>
+    <w:basedOn w:val="BodyText"/>
+    <w:qFormat/>
+    <w:pPr>
+      <w:pBdr>
+        <w:left w:val="single" w:sz="18" w:space="6" w:color="1D5F8A"/>
+      </w:pBdr>
+      <w:shd w:val="clear" w:color="auto" w:fill="F5F7F9"/>
+      <w:spacing w:before="60" w:after="120" w:line="264" w:lineRule="auto"/>
+      <w:ind w:left="140" w:right="140"/>
+      <w:jc w:val="left"/>
+    </w:pPr>
+    <w:rPr>
+      <w:rFonts w:ascii="Calibri" w:hAnsi="Calibri" w:eastAsia="Calibri" w:cs="Calibri"/>
+      <w:b/>
+      <w:bCs/>
+      <w:i w:val="0"/>
+      <w:iCs w:val="0"/>
+      <w:color w:val="212529"/>
+    </w:rPr>
+  </w:style>
+  <w:style w:type="paragraph" w:styleId="NotAnswered" w:customStyle="1">
+    <w:name w:val="Not Answered"/>
+    <w:basedOn w:val="BodyText"/>
+    <w:qFormat/>
+    <w:pPr>
+      <w:pBdr>
+        <w:left w:val="single" w:sz="18" w:space="6" w:color="DDE2E6"/>
+      </w:pBdr>
+      <w:spacing w:before="60" w:after="120" w:line="264" w:lineRule="auto"/>
+      <w:ind w:left="140" w:right="140"/>
+      <w:jc w:val="left"/>
+    </w:pPr>
+    <w:rPr>
+      <w:rFonts w:ascii="Calibri" w:hAnsi="Calibri" w:eastAsia="Calibri" w:cs="Calibri"/>
+      <w:b w:val="0"/>
+      <w:bCs w:val="0"/>
+      <w:i/>
+      <w:iCs/>
+      <w:color w:val="8A949E"/>
+      <w:sz w:val="18"/>
+      <w:szCs w:val="18"/>
+    </w:rPr>
+  </w:style>
+  <w:style w:type="paragraph" w:styleId="NotAnsweredRequired" w:customStyle="1">
+    <w:name w:val="Not Answered Required"/>
+    <w:basedOn w:val="BodyText"/>
+    <w:qFormat/>
+    <w:pPr>
+      <w:pBdr>
+        <w:left w:val="single" w:sz="18" w:space="6" w:color="B4232F"/>
+      </w:pBdr>
+      <w:shd w:val="clear" w:color="auto" w:fill="FBECED"/>
+      <w:spacing w:before="60" w:after="120" w:line="264" w:lineRule="auto"/>
+      <w:ind w:left="140" w:right="140"/>
+      <w:jc w:val="left"/>
+    </w:pPr>
+    <w:rPr>
+      <w:rFonts w:ascii="Calibri" w:hAnsi="Calibri" w:eastAsia="Calibri" w:cs="Calibri"/>
+      <w:b w:val="0"/>
+      <w:bCs w:val="0"/>
+      <w:i/>
+      <w:iCs/>
+      <w:color w:val="B4232F"/>
+      <w:sz w:val="18"/>
+      <w:szCs w:val="18"/>
+    </w:rPr>
+  </w:style>
+  <w:style w:type="paragraph" w:styleId="QuestionText" w:customStyle="1">
+    <w:name w:val="Question Text"/>
+    <w:basedOn w:val="BodyText"/>
+    <w:qFormat/>
+    <w:pPr>
+      <w:spacing w:before="0" w:after="80" w:line="264" w:lineRule="auto"/>
+      <w:jc w:val="left"/>
+    </w:pPr>
+    <w:rPr>
+      <w:rFonts w:ascii="Calibri" w:hAnsi="Calibri" w:eastAsia="Calibri" w:cs="Calibri"/>
+      <w:b w:val="0"/>
+      <w:bCs w:val="0"/>
+      <w:i w:val="0"/>
+      <w:iCs w:val="0"/>
+      <w:color w:val="5F6B76"/>
+      <w:sz w:val="18"/>
+      <w:szCs w:val="18"/>
+    </w:rPr>
+  </w:style>
+  <w:style w:type="paragraph" w:styleId="QuestionMeta" w:customStyle="1">
+    <w:name w:val="Question Meta"/>
+    <w:basedOn w:val="BodyText"/>
+    <w:qFormat/>
+    <w:pPr>
+      <w:spacing w:before="0" w:after="40" w:line="264" w:lineRule="auto"/>
+      <w:jc w:val="left"/>
+    </w:pPr>
+    <w:rPr>
+      <w:rFonts w:ascii="Calibri" w:hAnsi="Calibri" w:eastAsia="Calibri" w:cs="Calibri"/>
+      <w:b w:val="0"/>
+      <w:bCs w:val="0"/>
+      <w:i w:val="0"/>
+      <w:iCs w:val="0"/>
+      <w:color w:val="5F6B76"/>
+      <w:sz w:val="16"/>
+      <w:szCs w:val="16"/>
+    </w:rPr>
+  </w:style>
+  <w:style w:type="paragraph" w:styleId="Advice" w:customStyle="1">
+    <w:name w:val="Advice"/>
+    <w:basedOn w:val="BodyText"/>
+    <w:qFormat/>
+    <w:pPr>
+      <w:pBdr>
+        <w:left w:val="single" w:sz="12" w:space="6" w:color="1D5F8A"/>
+      </w:pBdr>
+      <w:shd w:val="clear" w:color="auto" w:fill="E8F1F7"/>
+      <w:spacing w:before="40" w:after="120" w:line="264" w:lineRule="auto"/>
+      <w:ind w:left="140" w:right="140"/>
+      <w:jc w:val="left"/>
+    </w:pPr>
+    <w:rPr>
+      <w:rFonts w:ascii="Calibri" w:hAnsi="Calibri" w:eastAsia="Calibri" w:cs="Calibri"/>
+      <w:b w:val="0"/>
+      <w:bCs w:val="0"/>
+      <w:i w:val="0"/>
+      <w:iCs w:val="0"/>
+      <w:color w:val="123F5C"/>
+      <w:sz w:val="18"/>
+      <w:szCs w:val="18"/>
+    </w:rPr>
+  </w:style>
+  <w:style w:type="paragraph" w:styleId="SectionLabel" w:customStyle="1">
+    <w:name w:val="Section Label"/>
+    <w:basedOn w:val="BodyText"/>
+    <w:qFormat/>
+    <w:pPr>
+      <w:keepNext/>
+      <w:keepLines/>
+      <w:spacing w:before="200" w:after="60" w:line="264" w:lineRule="auto"/>
+      <w:jc w:val="left"/>
+    </w:pPr>
+    <w:rPr>
+      <w:rFonts w:ascii="Calibri" w:hAnsi="Calibri" w:eastAsia="Calibri" w:cs="Calibri"/>
+      <w:b/>
+      <w:bCs/>
+      <w:i w:val="0"/>
+      <w:iCs w:val="0"/>
+      <w:caps/>
+      <w:color w:val="5F6B76"/>
+      <w:spacing w:val="12"/>
+      <w:sz w:val="15"/>
+      <w:szCs w:val="15"/>
+    </w:rPr>
+  </w:style>
+  <w:style w:type="paragraph" w:styleId="ChoiceSelected" w:customStyle="1">
+    <w:name w:val="Choice Selected"/>
+    <w:basedOn w:val="BodyText"/>
+    <w:qFormat/>
+    <w:pPr>
+      <w:spacing w:before="10" w:after="10" w:line="264" w:lineRule="auto"/>
+      <w:ind w:left="140" w:right="140"/>
+      <w:jc w:val="left"/>
+    </w:pPr>
+    <w:rPr>
+      <w:rFonts w:ascii="Calibri" w:hAnsi="Calibri" w:eastAsia="Calibri" w:cs="Calibri"/>
+      <w:b/>
+      <w:bCs/>
+      <w:i w:val="0"/>
+      <w:iCs w:val="0"/>
+      <w:color w:val="212529"/>
+    </w:rPr>
+  </w:style>
+  <w:style w:type="paragraph" w:styleId="ChoiceUnselected" w:customStyle="1">
+    <w:name w:val="Choice Unselected"/>
+    <w:basedOn w:val="BodyText"/>
+    <w:qFormat/>
+    <w:pPr>
+      <w:spacing w:before="10" w:after="10" w:line="264" w:lineRule="auto"/>
+      <w:ind w:left="140" w:right="140"/>
+      <w:jc w:val="left"/>
+    </w:pPr>
+    <w:rPr>
+      <w:rFonts w:ascii="Calibri" w:hAnsi="Calibri" w:eastAsia="Calibri" w:cs="Calibri"/>
+      <w:b w:val="0"/>
+      <w:bCs w:val="0"/>
+      <w:i w:val="0"/>
+      <w:iCs w:val="0"/>
+      <w:color w:val="8A949E"/>
+    </w:rPr>
+  </w:style>
+  <w:style w:type="paragraph" w:styleId="ItemHeading" w:customStyle="1">
+    <w:name w:val="Item Heading"/>
+    <w:basedOn w:val="BodyText"/>
+    <w:qFormat/>
+    <w:pPr>
+      <w:keepNext/>
+      <w:keepLines/>
+      <w:pBdr>
+        <w:top w:val="single" w:sz="8" w:space="4" w:color="DDE2E6"/>
+      </w:pBdr>
+      <w:spacing w:before="200" w:after="60" w:line="264" w:lineRule="auto"/>
+      <w:jc w:val="left"/>
+    </w:pPr>
+    <w:rPr>
+      <w:rFonts w:ascii="Calibri" w:hAnsi="Calibri" w:eastAsia="Calibri" w:cs="Calibri"/>
+      <w:b/>
+      <w:bCs/>
+      <w:i w:val="0"/>
+      <w:iCs w:val="0"/>
+      <w:color w:val="1D5F8A"/>
+      <w:sz w:val="16"/>
+      <w:szCs w:val="16"/>
+    </w:rPr>
+  </w:style>
+  <w:style w:type="paragraph" w:styleId="ToolInfo" w:customStyle="1">
+    <w:name w:val="Tool Info"/>
+    <w:basedOn w:val="BodyText"/>
+    <w:qFormat/>
+    <w:pPr>
+      <w:spacing w:before="2400" w:after="0" w:line="264" w:lineRule="auto"/>
+      <w:jc w:val="center"/>
+    </w:pPr>
+    <w:rPr>
+      <w:rFonts w:ascii="Calibri" w:hAnsi="Calibri" w:eastAsia="Calibri" w:cs="Calibri"/>
+      <w:b w:val="0"/>
+      <w:bCs w:val="0"/>
+      <w:i w:val="0"/>
+      <w:iCs w:val="0"/>
+      <w:color w:val="8A949E"/>
+      <w:sz w:val="16"/>
+      <w:szCs w:val="16"/>
+    </w:rPr>
+  </w:style>
+  <w:style w:type="character" w:styleId="QuestionNumber" w:customStyle="1">
+    <w:name w:val="Question Number"/>
+    <w:basedOn w:val="DefaultParagraphFont"/>
+    <w:qFormat/>
+    <w:rPr>
+      <w:color w:val="1D5F8A"/>
     </w:rPr>
   </w:style>
 </w:styles>

</xml_diff>